<commit_message>
PF3: audit fixes; speech reads arcsine/arccosine/arctangent, sin^-1 as inverse sine, and 1/2 sqrt 3 with 'times' (only PF3 readings change); audit notes, final support files and index
Co-Authored-By: Claude Opus 5.5 <noreply@anthropic.com>
Claude-Session: https://claude.ai/code/session_013Y8PfETWcMLvmUEpCdE8Wq
</commit_message>
<xml_diff>
--- a/support-materials/PF3/PF3_worked_examples.docx
+++ b/support-materials/PF3/PF3_worked_examples.docx
@@ -529,7 +529,17 @@
         <w:t xml:space="preserve">−π/4</w:t>
       </w:r>
       <w:r>
-        <w:t xml:space="preserve">. </w:t>
+        <w:t xml:space="preserve">, and cosine at </w:t>
+      </w:r>
+      <w:r>
+        <w:rPr>
+          <w:i/>
+          <w:iCs/>
+        </w:rPr>
+        <w:t xml:space="preserve">π/4</w:t>
+      </w:r>
+      <w:r>
+        <w:t xml:space="preserve"> is positive. </w:t>
       </w:r>
       <w:r>
         <w:rPr>
@@ -1021,7 +1031,27 @@
         <w:t xml:space="preserve">−(√3)/2</w:t>
       </w:r>
       <w:r>
-        <w:t xml:space="preserve">. </w:t>
+        <w:t xml:space="preserve">. The angle </w:t>
+      </w:r>
+      <w:r>
+        <w:rPr>
+          <w:i/>
+          <w:iCs/>
+        </w:rPr>
+        <w:t xml:space="preserve">(7π)/6</w:t>
+      </w:r>
+      <w:r>
+        <w:t xml:space="preserve"> also has sine </w:t>
+      </w:r>
+      <w:r>
+        <w:rPr>
+          <w:i/>
+          <w:iCs/>
+        </w:rPr>
+        <w:t xml:space="preserve">−1/2</w:t>
+      </w:r>
+      <w:r>
+        <w:t xml:space="preserve">, but it is on the left half of the circle. </w:t>
       </w:r>
       <w:r>
         <w:rPr>
@@ -1222,7 +1252,27 @@
         <w:t xml:space="preserve">−π/3</w:t>
       </w:r>
       <w:r>
-        <w:t xml:space="preserve"> uses arcsine's rule for negatives, which does not work for arccosine. </w:t>
+        <w:t xml:space="preserve"> uses arcsine's rule for negatives, which does not work for arccosine. The angle </w:t>
+      </w:r>
+      <w:r>
+        <w:rPr>
+          <w:i/>
+          <w:iCs/>
+        </w:rPr>
+        <w:t xml:space="preserve">(4π)/3</w:t>
+      </w:r>
+      <w:r>
+        <w:t xml:space="preserve"> is on the bottom half, and cosine at </w:t>
+      </w:r>
+      <w:r>
+        <w:rPr>
+          <w:i/>
+          <w:iCs/>
+        </w:rPr>
+        <w:t xml:space="preserve">π/3</w:t>
+      </w:r>
+      <w:r>
+        <w:t xml:space="preserve"> is positive. </w:t>
       </w:r>
       <w:r>
         <w:rPr>
@@ -1664,7 +1714,27 @@
         <w:t xml:space="preserve">π/2</w:t>
       </w:r>
       <w:r>
-        <w:t xml:space="preserve">. The answer 0 is arcsine of 0, not arccosine. </w:t>
+        <w:t xml:space="preserve">. The answer 0 is arcsine of 0, not arccosine. The angles </w:t>
+      </w:r>
+      <w:r>
+        <w:rPr>
+          <w:i/>
+          <w:iCs/>
+        </w:rPr>
+        <w:t xml:space="preserve">(3π)/2</w:t>
+      </w:r>
+      <w:r>
+        <w:t xml:space="preserve"> and </w:t>
+      </w:r>
+      <w:r>
+        <w:rPr>
+          <w:i/>
+          <w:iCs/>
+        </w:rPr>
+        <w:t xml:space="preserve">−π/2</w:t>
+      </w:r>
+      <w:r>
+        <w:t xml:space="preserve"> point to the bottom, outside the range. </w:t>
       </w:r>
       <w:r>
         <w:rPr>
@@ -1885,7 +1955,17 @@
         <w:t xml:space="preserve">(7π)/4</w:t>
       </w:r>
       <w:r>
-        <w:t xml:space="preserve"> also have that sine, but they are outside arcsine's range. </w:t>
+        <w:t xml:space="preserve"> also have that sine, but they are outside arcsine's range. Sine at </w:t>
+      </w:r>
+      <w:r>
+        <w:rPr>
+          <w:i/>
+          <w:iCs/>
+        </w:rPr>
+        <w:t xml:space="preserve">(3π)/4</w:t>
+      </w:r>
+      <w:r>
+        <w:t xml:space="preserve"> is positive. </w:t>
       </w:r>
       <w:r>
         <w:rPr>
@@ -2743,7 +2823,7 @@
           <wp:inline distT="0" distB="0" distL="0" distR="0">
             <wp:extent cx="2324100" cy="2476500"/>
             <wp:effectExtent t="0" r="0" b="0" l="0"/>
-            <wp:docPr id="1" name="graph1" descr="A curve between two solid end dots, with three labeled points. Plotted data: a curve that exists only from x = −1 to x = 1, with solid dots at both ends: (−1, −π/2) and (1, π/2). It passes through (0, 0) and rises from left to right. It is steepest near its two ends and flattest in the middle. Nothing is drawn to the left of x = −1 or to the right of x = 1." title="A curve between two solid end dots, with three labeled points"/>
+            <wp:docPr id="1" name="graph1" descr="A rising curve between two solid end dots, with three labeled points. Plotted data: a curve that exists only from x = −1 to x = 1, with solid dots at both ends: (−1, −π/2) and (1, π/2). It passes through (0, 0) and rises from left to right. It is steepest near its two ends and flattest in the middle. Nothing is drawn to the left of x = −1 or to the right of x = 1." title="A rising curve between two solid end dots, with three labeled points"/>
             <wp:cNvGraphicFramePr>
               <a:graphicFrameLocks xmlns:a="http://schemas.openxmlformats.org/drawingml/2006/main" noChangeAspect="1"/>
             </wp:cNvGraphicFramePr>
@@ -3619,7 +3699,20 @@
         <w:spacing w:after="120" w:before="80" w:line="300"/>
       </w:pPr>
       <w:r>
-        <w:t xml:space="preserve">A student wrote this because the sine of 2π/3 is the square root of 3 over 2. What is the mistake, if any?</w:t>
+        <w:t xml:space="preserve">A student wrote this because </w:t>
+      </w:r>
+      <w:r>
+        <w:t xml:space="preserve">sin</w:t>
+      </w:r>
+      <w:r>
+        <w:rPr>
+          <w:i/>
+          <w:iCs/>
+        </w:rPr>
+        <w:t xml:space="preserve">((2π)/3)=(√3)/2</w:t>
+      </w:r>
+      <w:r>
+        <w:t xml:space="preserve">. What is the mistake, if any?</w:t>
       </w:r>
     </w:p>
     <w:p>
@@ -3635,7 +3728,17 @@
         <w:t xml:space="preserve">A.  </w:t>
       </w:r>
       <w:r>
-        <w:t xml:space="preserve">Arcsine stops at π/2, so the answer is π/3.</w:t>
+        <w:t xml:space="preserve">Arcsine stays on the right half, so the answer is </w:t>
+      </w:r>
+      <w:r>
+        <w:rPr>
+          <w:i/>
+          <w:iCs/>
+        </w:rPr>
+        <w:t xml:space="preserve">π/3</w:t>
+      </w:r>
+      <w:r>
+        <w:t xml:space="preserve">.</w:t>
       </w:r>
     </w:p>
     <w:p>
@@ -3651,7 +3754,7 @@
         <w:t xml:space="preserve">B.  </w:t>
       </w:r>
       <w:r>
-        <w:t xml:space="preserve">The sine of 2π/3 is really one half, so the angle is wrong.</w:t>
+        <w:t xml:space="preserve">The sine of that angle is really one half, so the angle is wrong.</w:t>
       </w:r>
     </w:p>
     <w:p>
@@ -3667,7 +3770,17 @@
         <w:t xml:space="preserve">C.  </w:t>
       </w:r>
       <w:r>
-        <w:t xml:space="preserve">The answer should be 4π/3, the other angle with this sine.</w:t>
+        <w:t xml:space="preserve">The other angle with this sine works instead: </w:t>
+      </w:r>
+      <w:r>
+        <w:rPr>
+          <w:i/>
+          <w:iCs/>
+        </w:rPr>
+        <w:t xml:space="preserve">(4π)/3</w:t>
+      </w:r>
+      <w:r>
+        <w:t xml:space="preserve">.</w:t>
       </w:r>
     </w:p>
     <w:p>
@@ -3829,7 +3942,17 @@
         <w:t xml:space="preserve">B.  </w:t>
       </w:r>
       <w:r>
-        <w:t xml:space="preserve">The answer should be 5π/4, since cosine is negative there.</w:t>
+        <w:t xml:space="preserve">Cosine is negative there, so the answer is </w:t>
+      </w:r>
+      <w:r>
+        <w:rPr>
+          <w:i/>
+          <w:iCs/>
+        </w:rPr>
+        <w:t xml:space="preserve">(5π)/4</w:t>
+      </w:r>
+      <w:r>
+        <w:t xml:space="preserve">.</w:t>
       </w:r>
     </w:p>
     <w:p>
@@ -3845,7 +3968,17 @@
         <w:t xml:space="preserve">C.  </w:t>
       </w:r>
       <w:r>
-        <w:t xml:space="preserve">Arccosine is never negative; the answer is 3π/4.</w:t>
+        <w:t xml:space="preserve">Arccosine is never negative; the answer is </w:t>
+      </w:r>
+      <w:r>
+        <w:rPr>
+          <w:i/>
+          <w:iCs/>
+        </w:rPr>
+        <w:t xml:space="preserve">(3π)/4</w:t>
+      </w:r>
+      <w:r>
+        <w:t xml:space="preserve">.</w:t>
       </w:r>
     </w:p>
     <w:p>
@@ -3861,7 +3994,17 @@
         <w:t xml:space="preserve">D.  </w:t>
       </w:r>
       <w:r>
-        <w:t xml:space="preserve">The answer should be π/4, because arccosine ignores signs.</w:t>
+        <w:t xml:space="preserve">Arccosine ignores the sign, so the answer is </w:t>
+      </w:r>
+      <w:r>
+        <w:rPr>
+          <w:i/>
+          <w:iCs/>
+        </w:rPr>
+        <w:t xml:space="preserve">π/4</w:t>
+      </w:r>
+      <w:r>
+        <w:t xml:space="preserve">.</w:t>
       </w:r>
     </w:p>
     <w:p>
@@ -3988,7 +4131,17 @@
         <w:t xml:space="preserve">A.  </w:t>
       </w:r>
       <w:r>
-        <w:t xml:space="preserve">It equals π/2, because 2 is close to 1.</w:t>
+        <w:t xml:space="preserve">Since 2 is close to 1, it equals </w:t>
+      </w:r>
+      <w:r>
+        <w:rPr>
+          <w:i/>
+          <w:iCs/>
+        </w:rPr>
+        <w:t xml:space="preserve">π/2</w:t>
+      </w:r>
+      <w:r>
+        <w:t xml:space="preserve">.</w:t>
       </w:r>
     </w:p>
     <w:p>
@@ -4036,7 +4189,17 @@
         <w:t xml:space="preserve">D.  </w:t>
       </w:r>
       <w:r>
-        <w:t xml:space="preserve">It equals 2π, one full turn around the circle.</w:t>
+        <w:t xml:space="preserve">It equals one full turn around the circle, </w:t>
+      </w:r>
+      <w:r>
+        <w:rPr>
+          <w:i/>
+          <w:iCs/>
+        </w:rPr>
+        <w:t xml:space="preserve">2π</w:t>
+      </w:r>
+      <w:r>
+        <w:t xml:space="preserve">.</w:t>
       </w:r>
     </w:p>
     <w:p>
@@ -4111,7 +4274,17 @@
         <w:spacing w:after="120" w:before="80" w:line="300"/>
       </w:pPr>
       <w:r>
-        <w:t xml:space="preserve">A student says the range of this function is the closed interval from negative π/2 to π/2, with square brackets. What is the mistake, if any?</w:t>
+        <w:t xml:space="preserve">A student says the range of this function is </w:t>
+      </w:r>
+      <w:r>
+        <w:rPr>
+          <w:i/>
+          <w:iCs/>
+        </w:rPr>
+        <w:t xml:space="preserve">[−π/2,π/2]</w:t>
+      </w:r>
+      <w:r>
+        <w:t xml:space="preserve">, with square brackets. What is the mistake, if any?</w:t>
       </w:r>
     </w:p>
     <w:p>
@@ -4127,7 +4300,7 @@
         <w:t xml:space="preserve">A.  </w:t>
       </w:r>
       <w:r>
-        <w:t xml:space="preserve">The range should be all real numbers.</w:t>
+        <w:t xml:space="preserve">The range should be all real numbers, like the domain.</w:t>
       </w:r>
     </w:p>
     <w:p>
@@ -4143,7 +4316,17 @@
         <w:t xml:space="preserve">B.  </w:t>
       </w:r>
       <w:r>
-        <w:t xml:space="preserve">The range should be from 0 to π, the same as arccosine.</w:t>
+        <w:t xml:space="preserve">The range should match arccosine, </w:t>
+      </w:r>
+      <w:r>
+        <w:rPr>
+          <w:i/>
+          <w:iCs/>
+        </w:rPr>
+        <w:t xml:space="preserve">[0,π]</w:t>
+      </w:r>
+      <w:r>
+        <w:t xml:space="preserve">.</w:t>
       </w:r>
     </w:p>
     <w:p>

</xml_diff>

<commit_message>
PF3: show root values in textbook form (sqrt3/2, sqrt2/2, sqrt3/3); speech adds a comma after a root numerator (only PF3 readings change)
Co-Authored-By: Claude Opus 5.5 <noreply@anthropic.com>
Claude-Session: https://claude.ai/code/session_013Y8PfETWcMLvmUEpCdE8Wq
</commit_message>
<xml_diff>
--- a/support-materials/PF3/PF3_worked_examples.docx
+++ b/support-materials/PF3/PF3_worked_examples.docx
@@ -114,7 +114,7 @@
           <w:sz w:val="40"/>
           <w:szCs w:val="40"/>
         </w:rPr>
-        <w:t xml:space="preserve">arcsin(1/2√3)</w:t>
+        <w:t xml:space="preserve">arcsin((√3)/2)</w:t>
       </w:r>
     </w:p>
     <w:p>
@@ -365,7 +365,7 @@
           <w:sz w:val="40"/>
           <w:szCs w:val="40"/>
         </w:rPr>
-        <w:t xml:space="preserve">arccos(−1/2√2)</w:t>
+        <w:t xml:space="preserve">arccos(−(√2)/2)</w:t>
       </w:r>
     </w:p>
     <w:p>
@@ -1319,7 +1319,7 @@
           <w:sz w:val="40"/>
           <w:szCs w:val="40"/>
         </w:rPr>
-        <w:t xml:space="preserve">arctan(1/3√3)</w:t>
+        <w:t xml:space="preserve">arctan((√3)/3)</w:t>
       </w:r>
     </w:p>
     <w:p>
@@ -1781,7 +1781,7 @@
           <w:sz w:val="40"/>
           <w:szCs w:val="40"/>
         </w:rPr>
-        <w:t xml:space="preserve">arcsin(−1/2√2)</w:t>
+        <w:t xml:space="preserve">arcsin(−(√2)/2)</w:t>
       </w:r>
     </w:p>
     <w:p>

</xml_diff>

<commit_message>
PF3: re-audit before recording (slip format, in-tab spoilers, graph captions collapsed, distractor origins, endpoint/arctan(-1)/arccos-range coverage, speak lines, Quick Summary); doc tool prints single-term fractions without parentheses and inverse trig upright; regenerate docs and quiz
Co-Authored-By: Claude Opus 5.5 <noreply@anthropic.com>
Claude-Session: https://claude.ai/code/session_013Y8PfETWcMLvmUEpCdE8Wq
</commit_message>
<xml_diff>
--- a/support-materials/PF3/PF3_worked_examples.docx
+++ b/support-materials/PF3/PF3_worked_examples.docx
@@ -109,12 +109,19 @@
       </w:pPr>
       <w:r>
         <w:rPr>
-          <w:i/>
-          <w:iCs/>
           <w:sz w:val="40"/>
           <w:szCs w:val="40"/>
         </w:rPr>
-        <w:t xml:space="preserve">arcsin((√3)/2)</w:t>
+        <w:t xml:space="preserve">arccos</w:t>
+      </w:r>
+      <w:r>
+        <w:rPr>
+          <w:i/>
+          <w:iCs/>
+          <w:sz w:val="40"/>
+          <w:szCs w:val="40"/>
+        </w:rPr>
+        <w:t xml:space="preserve">(−1)</w:t>
       </w:r>
     </w:p>
     <w:p>
@@ -151,7 +158,7 @@
           <w:i/>
           <w:iCs/>
         </w:rPr>
-        <w:t xml:space="preserve">π/6</w:t>
+        <w:t xml:space="preserve">−π</w:t>
       </w:r>
     </w:p>
     <w:p>
@@ -171,7 +178,7 @@
           <w:i/>
           <w:iCs/>
         </w:rPr>
-        <w:t xml:space="preserve">(2π)/3</w:t>
+        <w:t xml:space="preserve">0</w:t>
       </w:r>
     </w:p>
     <w:p>
@@ -191,7 +198,7 @@
           <w:i/>
           <w:iCs/>
         </w:rPr>
-        <w:t xml:space="preserve">π/3</w:t>
+        <w:t xml:space="preserve">π/2</w:t>
       </w:r>
     </w:p>
     <w:p>
@@ -211,7 +218,7 @@
           <w:i/>
           <w:iCs/>
         </w:rPr>
-        <w:t xml:space="preserve">−π/3</w:t>
+        <w:t xml:space="preserve">π</w:t>
       </w:r>
     </w:p>
     <w:p>
@@ -228,57 +235,87 @@
         <w:spacing w:after="120" w:before="80" w:line="300"/>
       </w:pPr>
       <w:r>
-        <w:t xml:space="preserve">The input is </w:t>
-      </w:r>
-      <w:r>
-        <w:rPr>
-          <w:i/>
-          <w:iCs/>
-        </w:rPr>
-        <w:t xml:space="preserve">(√3)/2</w:t>
-      </w:r>
-      <w:r>
-        <w:t xml:space="preserve">. Which angle has sine </w:t>
-      </w:r>
-      <w:r>
-        <w:rPr>
-          <w:i/>
-          <w:iCs/>
-        </w:rPr>
-        <w:t xml:space="preserve">(√3)/2</w:t>
-      </w:r>
-      <w:r>
-        <w:t xml:space="preserve">? Both </w:t>
-      </w:r>
-      <w:r>
-        <w:rPr>
-          <w:i/>
-          <w:iCs/>
-        </w:rPr>
-        <w:t xml:space="preserve">π/3</w:t>
-      </w:r>
-      <w:r>
-        <w:t xml:space="preserve"> and </w:t>
-      </w:r>
-      <w:r>
-        <w:rPr>
-          <w:i/>
-          <w:iCs/>
-        </w:rPr>
-        <w:t xml:space="preserve">(2π)/3</w:t>
-      </w:r>
-      <w:r>
-        <w:t xml:space="preserve"> do, but arcsine only gives angles from </w:t>
-      </w:r>
-      <w:r>
-        <w:rPr>
-          <w:i/>
-          <w:iCs/>
-        </w:rPr>
-        <w:t xml:space="preserve">−π/2</w:t>
-      </w:r>
-      <w:r>
-        <w:t xml:space="preserve"> to </w:t>
+        <w:t xml:space="preserve">Cosine is the </w:t>
+      </w:r>
+      <w:r>
+        <w:rPr>
+          <w:i/>
+          <w:iCs/>
+        </w:rPr>
+        <w:t xml:space="preserve">x</w:t>
+      </w:r>
+      <w:r>
+        <w:t xml:space="preserve">-coordinate on the unit circle. It is </w:t>
+      </w:r>
+      <w:r>
+        <w:rPr>
+          <w:i/>
+          <w:iCs/>
+        </w:rPr>
+        <w:t xml:space="preserve">−1</w:t>
+      </w:r>
+      <w:r>
+        <w:t xml:space="preserve"> at the far left point, angle </w:t>
+      </w:r>
+      <w:r>
+        <w:rPr>
+          <w:i/>
+          <w:iCs/>
+        </w:rPr>
+        <w:t xml:space="preserve">π</w:t>
+      </w:r>
+      <w:r>
+        <w:t xml:space="preserve">. Arccosine gives angles from 0 to </w:t>
+      </w:r>
+      <w:r>
+        <w:rPr>
+          <w:i/>
+          <w:iCs/>
+        </w:rPr>
+        <w:t xml:space="preserve">π</w:t>
+      </w:r>
+      <w:r>
+        <w:t xml:space="preserve">, and </w:t>
+      </w:r>
+      <w:r>
+        <w:rPr>
+          <w:i/>
+          <w:iCs/>
+        </w:rPr>
+        <w:t xml:space="preserve">π</w:t>
+      </w:r>
+      <w:r>
+        <w:t xml:space="preserve"> is the end of that range, so it counts. </w:t>
+      </w:r>
+      <w:r>
+        <w:rPr>
+          <w:i/>
+          <w:iCs/>
+        </w:rPr>
+        <w:t xml:space="preserve">−π</w:t>
+      </w:r>
+      <w:r>
+        <w:t xml:space="preserve"> points to the same spot, but arccosine is never negative; 0 is the far right point, where the </w:t>
+      </w:r>
+      <w:r>
+        <w:rPr>
+          <w:i/>
+          <w:iCs/>
+        </w:rPr>
+        <w:t xml:space="preserve">x</w:t>
+      </w:r>
+      <w:r>
+        <w:t xml:space="preserve">-coordinate is 1, not </w:t>
+      </w:r>
+      <w:r>
+        <w:rPr>
+          <w:i/>
+          <w:iCs/>
+        </w:rPr>
+        <w:t xml:space="preserve">−1</w:t>
+      </w:r>
+      <w:r>
+        <w:t xml:space="preserve">; and </w:t>
       </w:r>
       <w:r>
         <w:rPr>
@@ -288,37 +325,27 @@
         <w:t xml:space="preserve">π/2</w:t>
       </w:r>
       <w:r>
-        <w:t xml:space="preserve">, so </w:t>
-      </w:r>
-      <w:r>
-        <w:rPr>
-          <w:i/>
-          <w:iCs/>
-        </w:rPr>
-        <w:t xml:space="preserve">(2π)/3</w:t>
-      </w:r>
-      <w:r>
-        <w:t xml:space="preserve"> is out. The angle </w:t>
-      </w:r>
-      <w:r>
-        <w:rPr>
-          <w:i/>
-          <w:iCs/>
-        </w:rPr>
-        <w:t xml:space="preserve">π/6</w:t>
-      </w:r>
-      <w:r>
-        <w:t xml:space="preserve"> has cosine </w:t>
-      </w:r>
-      <w:r>
-        <w:rPr>
-          <w:i/>
-          <w:iCs/>
-        </w:rPr>
-        <w:t xml:space="preserve">(√3)/2</w:t>
-      </w:r>
-      <w:r>
-        <w:t xml:space="preserve">, not sine. </w:t>
+        <w:t xml:space="preserve"> is the top of the circle, where the </w:t>
+      </w:r>
+      <w:r>
+        <w:rPr>
+          <w:i/>
+          <w:iCs/>
+        </w:rPr>
+        <w:t xml:space="preserve">x</w:t>
+      </w:r>
+      <w:r>
+        <w:t xml:space="preserve">-coordinate is not </w:t>
+      </w:r>
+      <w:r>
+        <w:rPr>
+          <w:i/>
+          <w:iCs/>
+        </w:rPr>
+        <w:t xml:space="preserve">−1</w:t>
+      </w:r>
+      <w:r>
+        <w:t xml:space="preserve"> either. </w:t>
       </w:r>
       <w:r>
         <w:rPr>
@@ -334,7 +361,7 @@
           <w:i/>
           <w:iCs/>
         </w:rPr>
-        <w:t xml:space="preserve">π/3</w:t>
+        <w:t xml:space="preserve">π</w:t>
       </w:r>
       <w:r>
         <w:rPr>
@@ -360,12 +387,19 @@
       </w:pPr>
       <w:r>
         <w:rPr>
-          <w:i/>
-          <w:iCs/>
           <w:sz w:val="40"/>
           <w:szCs w:val="40"/>
         </w:rPr>
-        <w:t xml:space="preserve">arccos(−(√2)/2)</w:t>
+        <w:t xml:space="preserve">arccos</w:t>
+      </w:r>
+      <w:r>
+        <w:rPr>
+          <w:i/>
+          <w:iCs/>
+          <w:sz w:val="40"/>
+          <w:szCs w:val="40"/>
+        </w:rPr>
+        <w:t xml:space="preserve">(−√2/2)</w:t>
       </w:r>
     </w:p>
     <w:p>
@@ -422,7 +456,7 @@
           <w:i/>
           <w:iCs/>
         </w:rPr>
-        <w:t xml:space="preserve">(3π)/4</w:t>
+        <w:t xml:space="preserve">3π/4</w:t>
       </w:r>
     </w:p>
     <w:p>
@@ -442,7 +476,7 @@
           <w:i/>
           <w:iCs/>
         </w:rPr>
-        <w:t xml:space="preserve">(5π)/4</w:t>
+        <w:t xml:space="preserve">5π/4</w:t>
       </w:r>
     </w:p>
     <w:p>
@@ -486,7 +520,7 @@
           <w:i/>
           <w:iCs/>
         </w:rPr>
-        <w:t xml:space="preserve">−(√2)/2</w:t>
+        <w:t xml:space="preserve">−√2/2</w:t>
       </w:r>
       <w:r>
         <w:t xml:space="preserve">. Arccosine gives angles from 0 to </w:t>
@@ -506,7 +540,7 @@
           <w:i/>
           <w:iCs/>
         </w:rPr>
-        <w:t xml:space="preserve">(3π)/4</w:t>
+        <w:t xml:space="preserve">3π/4</w:t>
       </w:r>
       <w:r>
         <w:t xml:space="preserve">. The angle </w:t>
@@ -516,7 +550,7 @@
           <w:i/>
           <w:iCs/>
         </w:rPr>
-        <w:t xml:space="preserve">(5π)/4</w:t>
+        <w:t xml:space="preserve">5π/4</w:t>
       </w:r>
       <w:r>
         <w:t xml:space="preserve"> also has that cosine but is on the bottom half. Arccosine is never negative, which rules out </w:t>
@@ -555,7 +589,7 @@
           <w:i/>
           <w:iCs/>
         </w:rPr>
-        <w:t xml:space="preserve">(3π)/4</w:t>
+        <w:t xml:space="preserve">3π/4</w:t>
       </w:r>
       <w:r>
         <w:rPr>
@@ -581,12 +615,19 @@
       </w:pPr>
       <w:r>
         <w:rPr>
-          <w:i/>
-          <w:iCs/>
           <w:sz w:val="40"/>
           <w:szCs w:val="40"/>
         </w:rPr>
-        <w:t xml:space="preserve">arctan(−√3)</w:t>
+        <w:t xml:space="preserve">arctan</w:t>
+      </w:r>
+      <w:r>
+        <w:rPr>
+          <w:i/>
+          <w:iCs/>
+          <w:sz w:val="40"/>
+          <w:szCs w:val="40"/>
+        </w:rPr>
+        <w:t xml:space="preserve">(−√3)</w:t>
       </w:r>
     </w:p>
     <w:p>
@@ -623,7 +664,7 @@
           <w:i/>
           <w:iCs/>
         </w:rPr>
-        <w:t xml:space="preserve">(2π)/3</w:t>
+        <w:t xml:space="preserve">2π/3</w:t>
       </w:r>
     </w:p>
     <w:p>
@@ -663,7 +704,7 @@
           <w:i/>
           <w:iCs/>
         </w:rPr>
-        <w:t xml:space="preserve">(5π)/3</w:t>
+        <w:t xml:space="preserve">5π/3</w:t>
       </w:r>
     </w:p>
     <w:p>
@@ -757,7 +798,7 @@
           <w:i/>
           <w:iCs/>
         </w:rPr>
-        <w:t xml:space="preserve">(2π)/3</w:t>
+        <w:t xml:space="preserve">2π/3</w:t>
       </w:r>
       <w:r>
         <w:t xml:space="preserve"> and </w:t>
@@ -767,7 +808,7 @@
           <w:i/>
           <w:iCs/>
         </w:rPr>
-        <w:t xml:space="preserve">(5π)/3</w:t>
+        <w:t xml:space="preserve">5π/3</w:t>
       </w:r>
       <w:r>
         <w:t xml:space="preserve"> have the same tangent but are outside the range. Tangent at </w:t>
@@ -787,7 +828,7 @@
           <w:i/>
           <w:iCs/>
         </w:rPr>
-        <w:t xml:space="preserve">−(√3)/3</w:t>
+        <w:t xml:space="preserve">−√3/3</w:t>
       </w:r>
       <w:r>
         <w:t xml:space="preserve">. </w:t>
@@ -832,12 +873,19 @@
       </w:pPr>
       <w:r>
         <w:rPr>
-          <w:i/>
-          <w:iCs/>
           <w:sz w:val="40"/>
           <w:szCs w:val="40"/>
         </w:rPr>
-        <w:t xml:space="preserve">arcsin(−1/2)</w:t>
+        <w:t xml:space="preserve">arcsin</w:t>
+      </w:r>
+      <w:r>
+        <w:rPr>
+          <w:i/>
+          <w:iCs/>
+          <w:sz w:val="40"/>
+          <w:szCs w:val="40"/>
+        </w:rPr>
+        <w:t xml:space="preserve">(−1/2)</w:t>
       </w:r>
     </w:p>
     <w:p>
@@ -894,7 +942,7 @@
           <w:i/>
           <w:iCs/>
         </w:rPr>
-        <w:t xml:space="preserve">(7π)/6</w:t>
+        <w:t xml:space="preserve">7π/6</w:t>
       </w:r>
     </w:p>
     <w:p>
@@ -914,7 +962,7 @@
           <w:i/>
           <w:iCs/>
         </w:rPr>
-        <w:t xml:space="preserve">(11π)/6</w:t>
+        <w:t xml:space="preserve">11π/6</w:t>
       </w:r>
     </w:p>
     <w:p>
@@ -988,7 +1036,7 @@
           <w:i/>
           <w:iCs/>
         </w:rPr>
-        <w:t xml:space="preserve">(11π)/6</w:t>
+        <w:t xml:space="preserve">11π/6</w:t>
       </w:r>
       <w:r>
         <w:t xml:space="preserve"> points the same way, but arcsine's range only goes down to </w:t>
@@ -1028,7 +1076,7 @@
           <w:i/>
           <w:iCs/>
         </w:rPr>
-        <w:t xml:space="preserve">−(√3)/2</w:t>
+        <w:t xml:space="preserve">−√3/2</w:t>
       </w:r>
       <w:r>
         <w:t xml:space="preserve">. The angle </w:t>
@@ -1038,7 +1086,7 @@
           <w:i/>
           <w:iCs/>
         </w:rPr>
-        <w:t xml:space="preserve">(7π)/6</w:t>
+        <w:t xml:space="preserve">7π/6</w:t>
       </w:r>
       <w:r>
         <w:t xml:space="preserve"> also has sine </w:t>
@@ -1093,12 +1141,19 @@
       </w:pPr>
       <w:r>
         <w:rPr>
-          <w:i/>
-          <w:iCs/>
           <w:sz w:val="40"/>
           <w:szCs w:val="40"/>
         </w:rPr>
-        <w:t xml:space="preserve">arccos(−1/2)</w:t>
+        <w:t xml:space="preserve">arccos</w:t>
+      </w:r>
+      <w:r>
+        <w:rPr>
+          <w:i/>
+          <w:iCs/>
+          <w:sz w:val="40"/>
+          <w:szCs w:val="40"/>
+        </w:rPr>
+        <w:t xml:space="preserve">(−1/2)</w:t>
       </w:r>
     </w:p>
     <w:p>
@@ -1155,7 +1210,7 @@
           <w:i/>
           <w:iCs/>
         </w:rPr>
-        <w:t xml:space="preserve">(4π)/3</w:t>
+        <w:t xml:space="preserve">4π/3</w:t>
       </w:r>
     </w:p>
     <w:p>
@@ -1175,7 +1230,7 @@
           <w:i/>
           <w:iCs/>
         </w:rPr>
-        <w:t xml:space="preserve">(2π)/3</w:t>
+        <w:t xml:space="preserve">2π/3</w:t>
       </w:r>
     </w:p>
     <w:p>
@@ -1239,7 +1294,7 @@
           <w:i/>
           <w:iCs/>
         </w:rPr>
-        <w:t xml:space="preserve">π−π/3=(2π)/3</w:t>
+        <w:t xml:space="preserve">π−π/3=2π/3</w:t>
       </w:r>
       <w:r>
         <w:t xml:space="preserve">. The answer </w:t>
@@ -1252,14 +1307,24 @@
         <w:t xml:space="preserve">−π/3</w:t>
       </w:r>
       <w:r>
-        <w:t xml:space="preserve"> uses arcsine's rule for negatives, which does not work for arccosine. The angle </w:t>
-      </w:r>
-      <w:r>
-        <w:rPr>
-          <w:i/>
-          <w:iCs/>
-        </w:rPr>
-        <w:t xml:space="preserve">(4π)/3</w:t>
+        <w:t xml:space="preserve"> is below the </w:t>
+      </w:r>
+      <w:r>
+        <w:rPr>
+          <w:i/>
+          <w:iCs/>
+        </w:rPr>
+        <w:t xml:space="preserve">x</w:t>
+      </w:r>
+      <w:r>
+        <w:t xml:space="preserve">-axis, but arccosine never leaves the top half. The angle </w:t>
+      </w:r>
+      <w:r>
+        <w:rPr>
+          <w:i/>
+          <w:iCs/>
+        </w:rPr>
+        <w:t xml:space="preserve">4π/3</w:t>
       </w:r>
       <w:r>
         <w:t xml:space="preserve"> is on the bottom half, and cosine at </w:t>
@@ -1288,7 +1353,7 @@
           <w:i/>
           <w:iCs/>
         </w:rPr>
-        <w:t xml:space="preserve">(2π)/3</w:t>
+        <w:t xml:space="preserve">2π/3</w:t>
       </w:r>
       <w:r>
         <w:rPr>
@@ -1314,12 +1379,19 @@
       </w:pPr>
       <w:r>
         <w:rPr>
-          <w:i/>
-          <w:iCs/>
           <w:sz w:val="40"/>
           <w:szCs w:val="40"/>
         </w:rPr>
-        <w:t xml:space="preserve">arctan((√3)/3)</w:t>
+        <w:t xml:space="preserve">arctan</w:t>
+      </w:r>
+      <w:r>
+        <w:rPr>
+          <w:i/>
+          <w:iCs/>
+          <w:sz w:val="40"/>
+          <w:szCs w:val="40"/>
+        </w:rPr>
+        <w:t xml:space="preserve">(√3/3)</w:t>
       </w:r>
     </w:p>
     <w:p>
@@ -1396,7 +1468,7 @@
           <w:i/>
           <w:iCs/>
         </w:rPr>
-        <w:t xml:space="preserve">(7π)/6</w:t>
+        <w:t xml:space="preserve">7π/6</w:t>
       </w:r>
     </w:p>
     <w:p>
@@ -1440,7 +1512,7 @@
           <w:i/>
           <w:iCs/>
         </w:rPr>
-        <w:t xml:space="preserve">(√3)/3</w:t>
+        <w:t xml:space="preserve">√3/3</w:t>
       </w:r>
       <w:r>
         <w:t xml:space="preserve">, which is the same as </w:t>
@@ -1450,7 +1522,7 @@
           <w:i/>
           <w:iCs/>
         </w:rPr>
-        <w:t xml:space="preserve">1/(√3)</w:t>
+        <w:t xml:space="preserve">1/√3</w:t>
       </w:r>
       <w:r>
         <w:t xml:space="preserve">. At </w:t>
@@ -1480,7 +1552,7 @@
           <w:i/>
           <w:iCs/>
         </w:rPr>
-        <w:t xml:space="preserve">(√3)/2</w:t>
+        <w:t xml:space="preserve">√3/2</w:t>
       </w:r>
       <w:r>
         <w:t xml:space="preserve">, so tangent is </w:t>
@@ -1490,7 +1562,7 @@
           <w:i/>
           <w:iCs/>
         </w:rPr>
-        <w:t xml:space="preserve">1/(√3)</w:t>
+        <w:t xml:space="preserve">1/√3</w:t>
       </w:r>
       <w:r>
         <w:t xml:space="preserve">. At </w:t>
@@ -1530,7 +1602,7 @@
           <w:i/>
           <w:iCs/>
         </w:rPr>
-        <w:t xml:space="preserve">(7π)/6</w:t>
+        <w:t xml:space="preserve">7π/6</w:t>
       </w:r>
       <w:r>
         <w:t xml:space="preserve"> has the same tangent but is outside the range. </w:t>
@@ -1575,12 +1647,19 @@
       </w:pPr>
       <w:r>
         <w:rPr>
-          <w:i/>
-          <w:iCs/>
           <w:sz w:val="40"/>
           <w:szCs w:val="40"/>
         </w:rPr>
-        <w:t xml:space="preserve">arccos(0)</w:t>
+        <w:t xml:space="preserve">arccos</w:t>
+      </w:r>
+      <w:r>
+        <w:rPr>
+          <w:i/>
+          <w:iCs/>
+          <w:sz w:val="40"/>
+          <w:szCs w:val="40"/>
+        </w:rPr>
+        <w:t xml:space="preserve">(0)</w:t>
       </w:r>
     </w:p>
     <w:p>
@@ -1637,7 +1716,7 @@
           <w:i/>
           <w:iCs/>
         </w:rPr>
-        <w:t xml:space="preserve">(3π)/2</w:t>
+        <w:t xml:space="preserve">3π/2</w:t>
       </w:r>
     </w:p>
     <w:p>
@@ -1721,7 +1800,7 @@
           <w:i/>
           <w:iCs/>
         </w:rPr>
-        <w:t xml:space="preserve">(3π)/2</w:t>
+        <w:t xml:space="preserve">3π/2</w:t>
       </w:r>
       <w:r>
         <w:t xml:space="preserve"> and </w:t>
@@ -1776,12 +1855,19 @@
       </w:pPr>
       <w:r>
         <w:rPr>
-          <w:i/>
-          <w:iCs/>
           <w:sz w:val="40"/>
           <w:szCs w:val="40"/>
         </w:rPr>
-        <w:t xml:space="preserve">arcsin(−(√2)/2)</w:t>
+        <w:t xml:space="preserve">arctan</w:t>
+      </w:r>
+      <w:r>
+        <w:rPr>
+          <w:i/>
+          <w:iCs/>
+          <w:sz w:val="40"/>
+          <w:szCs w:val="40"/>
+        </w:rPr>
+        <w:t xml:space="preserve">(−1)</w:t>
       </w:r>
     </w:p>
     <w:p>
@@ -1818,7 +1904,7 @@
           <w:i/>
           <w:iCs/>
         </w:rPr>
-        <w:t xml:space="preserve">(5π)/4</w:t>
+        <w:t xml:space="preserve">3π/4</w:t>
       </w:r>
     </w:p>
     <w:p>
@@ -1838,7 +1924,7 @@
           <w:i/>
           <w:iCs/>
         </w:rPr>
-        <w:t xml:space="preserve">(7π)/4</w:t>
+        <w:t xml:space="preserve">−5π/4</w:t>
       </w:r>
     </w:p>
     <w:p>
@@ -1878,7 +1964,7 @@
           <w:i/>
           <w:iCs/>
         </w:rPr>
-        <w:t xml:space="preserve">(3π)/4</w:t>
+        <w:t xml:space="preserve">π/4</w:t>
       </w:r>
     </w:p>
     <w:p>
@@ -1895,27 +1981,7 @@
         <w:spacing w:after="120" w:before="80" w:line="300"/>
       </w:pPr>
       <w:r>
-        <w:t xml:space="preserve">The input is </w:t>
-      </w:r>
-      <w:r>
-        <w:rPr>
-          <w:i/>
-          <w:iCs/>
-        </w:rPr>
-        <w:t xml:space="preserve">−(√2)/2</w:t>
-      </w:r>
-      <w:r>
-        <w:t xml:space="preserve">. Sine is </w:t>
-      </w:r>
-      <w:r>
-        <w:rPr>
-          <w:i/>
-          <w:iCs/>
-        </w:rPr>
-        <w:t xml:space="preserve">(√2)/2</w:t>
-      </w:r>
-      <w:r>
-        <w:t xml:space="preserve"> at </w:t>
+        <w:t xml:space="preserve">Tangent is 1 at </w:t>
       </w:r>
       <w:r>
         <w:rPr>
@@ -1925,7 +1991,17 @@
         <w:t xml:space="preserve">π/4</w:t>
       </w:r>
       <w:r>
-        <w:t xml:space="preserve">, and a negative input to arcsine gives a negative angle: </w:t>
+        <w:t xml:space="preserve">, where sine and cosine are equal. A negative input to arctangent gives a negative angle, between </w:t>
+      </w:r>
+      <w:r>
+        <w:rPr>
+          <w:i/>
+          <w:iCs/>
+        </w:rPr>
+        <w:t xml:space="preserve">−π/2</w:t>
+      </w:r>
+      <w:r>
+        <w:t xml:space="preserve"> and 0: </w:t>
       </w:r>
       <w:r>
         <w:rPr>
@@ -1942,7 +2018,7 @@
           <w:i/>
           <w:iCs/>
         </w:rPr>
-        <w:t xml:space="preserve">(5π)/4</w:t>
+        <w:t xml:space="preserve">3π/4</w:t>
       </w:r>
       <w:r>
         <w:t xml:space="preserve"> and </w:t>
@@ -1952,20 +2028,30 @@
           <w:i/>
           <w:iCs/>
         </w:rPr>
-        <w:t xml:space="preserve">(7π)/4</w:t>
-      </w:r>
-      <w:r>
-        <w:t xml:space="preserve"> also have that sine, but they are outside arcsine's range. Sine at </w:t>
-      </w:r>
-      <w:r>
-        <w:rPr>
-          <w:i/>
-          <w:iCs/>
-        </w:rPr>
-        <w:t xml:space="preserve">(3π)/4</w:t>
-      </w:r>
-      <w:r>
-        <w:t xml:space="preserve"> is positive. </w:t>
+        <w:t xml:space="preserve">−5π/4</w:t>
+      </w:r>
+      <w:r>
+        <w:t xml:space="preserve"> also have tangent </w:t>
+      </w:r>
+      <w:r>
+        <w:rPr>
+          <w:i/>
+          <w:iCs/>
+        </w:rPr>
+        <w:t xml:space="preserve">−1</w:t>
+      </w:r>
+      <w:r>
+        <w:t xml:space="preserve">, but they are outside arctangent's range; and </w:t>
+      </w:r>
+      <w:r>
+        <w:rPr>
+          <w:i/>
+          <w:iCs/>
+        </w:rPr>
+        <w:t xml:space="preserve">π/4</w:t>
+      </w:r>
+      <w:r>
+        <w:t xml:space="preserve"> drops the sign. </w:t>
       </w:r>
       <w:r>
         <w:rPr>
@@ -2012,7 +2098,23 @@
           <w:sz w:val="40"/>
           <w:szCs w:val="40"/>
         </w:rPr>
-        <w:t xml:space="preserve">f(x)=arcsin(x)</w:t>
+        <w:t xml:space="preserve">f(x)=</w:t>
+      </w:r>
+      <w:r>
+        <w:rPr>
+          <w:sz w:val="40"/>
+          <w:szCs w:val="40"/>
+        </w:rPr>
+        <w:t xml:space="preserve">arcsin</w:t>
+      </w:r>
+      <w:r>
+        <w:rPr>
+          <w:i/>
+          <w:iCs/>
+          <w:sz w:val="40"/>
+          <w:szCs w:val="40"/>
+        </w:rPr>
+        <w:t xml:space="preserve">(x)</w:t>
       </w:r>
     </w:p>
     <w:p>
@@ -2049,7 +2151,7 @@
           <w:i/>
           <w:iCs/>
         </w:rPr>
-        <w:t xml:space="preserve">[0,π]</w:t>
+        <w:t xml:space="preserve">[0,π/2]</w:t>
       </w:r>
     </w:p>
     <w:p>
@@ -2109,7 +2211,7 @@
           <w:i/>
           <w:iCs/>
         </w:rPr>
-        <w:t xml:space="preserve">[−1,1]</w:t>
+        <w:t xml:space="preserve">[−π,π]</w:t>
       </w:r>
     </w:p>
     <w:p>
@@ -2149,44 +2251,50 @@
         <w:t xml:space="preserve">, and it reaches both ends: </w:t>
       </w:r>
       <w:r>
-        <w:rPr>
-          <w:i/>
-          <w:iCs/>
-        </w:rPr>
-        <w:t xml:space="preserve">arcsin(1)=π/2</w:t>
+        <w:t xml:space="preserve">arcsin</w:t>
+      </w:r>
+      <w:r>
+        <w:rPr>
+          <w:i/>
+          <w:iCs/>
+        </w:rPr>
+        <w:t xml:space="preserve">(1)=π/2</w:t>
       </w:r>
       <w:r>
         <w:t xml:space="preserve"> and </w:t>
       </w:r>
       <w:r>
-        <w:rPr>
-          <w:i/>
-          <w:iCs/>
-        </w:rPr>
-        <w:t xml:space="preserve">arcsin(−1)=−π/2</w:t>
-      </w:r>
-      <w:r>
-        <w:t xml:space="preserve">. So the brackets are square. The interval from </w:t>
-      </w:r>
-      <w:r>
-        <w:rPr>
-          <w:i/>
-          <w:iCs/>
-        </w:rPr>
-        <w:t xml:space="preserve">−1</w:t>
-      </w:r>
-      <w:r>
-        <w:t xml:space="preserve"> to </w:t>
-      </w:r>
-      <w:r>
-        <w:rPr>
-          <w:i/>
-          <w:iCs/>
-        </w:rPr>
-        <w:t xml:space="preserve">1</w:t>
-      </w:r>
-      <w:r>
-        <w:t xml:space="preserve"> is the domain, the inputs. </w:t>
+        <w:t xml:space="preserve">arcsin</w:t>
+      </w:r>
+      <w:r>
+        <w:rPr>
+          <w:i/>
+          <w:iCs/>
+        </w:rPr>
+        <w:t xml:space="preserve">(−1)=−π/2</w:t>
+      </w:r>
+      <w:r>
+        <w:t xml:space="preserve">. So the brackets are square, not round. </w:t>
+      </w:r>
+      <w:r>
+        <w:rPr>
+          <w:i/>
+          <w:iCs/>
+        </w:rPr>
+        <w:t xml:space="preserve">[0,π/2]</w:t>
+      </w:r>
+      <w:r>
+        <w:t xml:space="preserve"> forgets that negative inputs give negative angles, and </w:t>
+      </w:r>
+      <w:r>
+        <w:rPr>
+          <w:i/>
+          <w:iCs/>
+        </w:rPr>
+        <w:t xml:space="preserve">[−π,π]</w:t>
+      </w:r>
+      <w:r>
+        <w:t xml:space="preserve"> is a whole turn, but arcsine gives just one angle for each input. </w:t>
       </w:r>
       <w:r>
         <w:rPr>
@@ -2233,7 +2341,23 @@
           <w:sz w:val="40"/>
           <w:szCs w:val="40"/>
         </w:rPr>
-        <w:t xml:space="preserve">g(x)=arccos(x)</w:t>
+        <w:t xml:space="preserve">g(x)=</w:t>
+      </w:r>
+      <w:r>
+        <w:rPr>
+          <w:sz w:val="40"/>
+          <w:szCs w:val="40"/>
+        </w:rPr>
+        <w:t xml:space="preserve">arccos</w:t>
+      </w:r>
+      <w:r>
+        <w:rPr>
+          <w:i/>
+          <w:iCs/>
+          <w:sz w:val="40"/>
+          <w:szCs w:val="40"/>
+        </w:rPr>
+        <w:t xml:space="preserve">(x)</w:t>
       </w:r>
     </w:p>
     <w:p>
@@ -2290,7 +2414,7 @@
           <w:i/>
           <w:iCs/>
         </w:rPr>
-        <w:t xml:space="preserve">[0,π]</w:t>
+        <w:t xml:space="preserve">[0,1]</w:t>
       </w:r>
     </w:p>
     <w:p>
@@ -2367,27 +2491,50 @@
         <w:t xml:space="preserve">1</w:t>
       </w:r>
       <w:r>
-        <w:t xml:space="preserve">. So only those inputs make sense: </w:t>
-      </w:r>
-      <w:r>
-        <w:rPr>
-          <w:i/>
-          <w:iCs/>
-        </w:rPr>
-        <w:t xml:space="preserve">arccos(2)</w:t>
-      </w:r>
-      <w:r>
-        <w:t xml:space="preserve"> has no answer. The interval from 0 to </w:t>
-      </w:r>
-      <w:r>
-        <w:rPr>
-          <w:i/>
-          <w:iCs/>
-        </w:rPr>
-        <w:t xml:space="preserve">π</w:t>
-      </w:r>
-      <w:r>
-        <w:t xml:space="preserve"> is the range, the outputs. </w:t>
+        <w:t xml:space="preserve">, negative on the left half of the circle. So exactly those inputs make sense: </w:t>
+      </w:r>
+      <w:r>
+        <w:t xml:space="preserve">arccos</w:t>
+      </w:r>
+      <w:r>
+        <w:rPr>
+          <w:i/>
+          <w:iCs/>
+        </w:rPr>
+        <w:t xml:space="preserve">(2)</w:t>
+      </w:r>
+      <w:r>
+        <w:t xml:space="preserve"> has no answer. </w:t>
+      </w:r>
+      <w:r>
+        <w:rPr>
+          <w:i/>
+          <w:iCs/>
+        </w:rPr>
+        <w:t xml:space="preserve">[0,1]</w:t>
+      </w:r>
+      <w:r>
+        <w:t xml:space="preserve"> leaves out the negative cosines; </w:t>
+      </w:r>
+      <w:r>
+        <w:rPr>
+          <w:i/>
+          <w:iCs/>
+        </w:rPr>
+        <w:t xml:space="preserve">(−∞,∞)</w:t>
+      </w:r>
+      <w:r>
+        <w:t xml:space="preserve"> would need cosine to take every value; and </w:t>
+      </w:r>
+      <w:r>
+        <w:rPr>
+          <w:i/>
+          <w:iCs/>
+        </w:rPr>
+        <w:t xml:space="preserve">[−π/2,π/2]</w:t>
+      </w:r>
+      <w:r>
+        <w:t xml:space="preserve"> is a set of angles, but the input here is a cosine value, a number. </w:t>
       </w:r>
       <w:r>
         <w:rPr>
@@ -2434,7 +2581,23 @@
           <w:sz w:val="40"/>
           <w:szCs w:val="40"/>
         </w:rPr>
-        <w:t xml:space="preserve">h(x)=arctan(x)</w:t>
+        <w:t xml:space="preserve">h(x)=</w:t>
+      </w:r>
+      <w:r>
+        <w:rPr>
+          <w:sz w:val="40"/>
+          <w:szCs w:val="40"/>
+        </w:rPr>
+        <w:t xml:space="preserve">arctan</w:t>
+      </w:r>
+      <w:r>
+        <w:rPr>
+          <w:i/>
+          <w:iCs/>
+          <w:sz w:val="40"/>
+          <w:szCs w:val="40"/>
+        </w:rPr>
+        <w:t xml:space="preserve">(x)</w:t>
       </w:r>
     </w:p>
     <w:p>
@@ -2531,7 +2694,7 @@
           <w:i/>
           <w:iCs/>
         </w:rPr>
-        <w:t xml:space="preserve">[0,π]</w:t>
+        <w:t xml:space="preserve">(0,π)</w:t>
       </w:r>
     </w:p>
     <w:p>
@@ -2548,7 +2711,7 @@
         <w:spacing w:after="120" w:before="80" w:line="300"/>
       </w:pPr>
       <w:r>
-        <w:t xml:space="preserve">Arctangent gives angles on the right half of the circle, like arcsine. But tangent is undefined at </w:t>
+        <w:t xml:space="preserve">Arctangent gives angles on the right half of the circle. But tangent is undefined at </w:t>
       </w:r>
       <w:r>
         <w:rPr>
@@ -2558,7 +2721,27 @@
         <w:t xml:space="preserve">±π/2</w:t>
       </w:r>
       <w:r>
-        <w:t xml:space="preserve">, so arctangent never reaches those angles; its graph only gets closer and closer to them. The ends are left out, so the brackets are round. All real numbers is the domain. </w:t>
+        <w:t xml:space="preserve">, so arctangent never reaches those angles; its graph only gets closer and closer to them. The ends are left out, so the brackets are round, not square. </w:t>
+      </w:r>
+      <w:r>
+        <w:rPr>
+          <w:i/>
+          <w:iCs/>
+        </w:rPr>
+        <w:t xml:space="preserve">(−∞,∞)</w:t>
+      </w:r>
+      <w:r>
+        <w:t xml:space="preserve"> is what goes in, the domain, not what comes out; and </w:t>
+      </w:r>
+      <w:r>
+        <w:rPr>
+          <w:i/>
+          <w:iCs/>
+        </w:rPr>
+        <w:t xml:space="preserve">(0,π)</w:t>
+      </w:r>
+      <w:r>
+        <w:t xml:space="preserve"> is the top half of the circle, but a negative input to arctangent gives a negative angle. </w:t>
       </w:r>
       <w:r>
         <w:rPr>
@@ -2590,7 +2773,7 @@
         <w:pageBreakBefore/>
       </w:pPr>
       <w:r>
-        <w:t xml:space="preserve">Example 12: Domain 2</w:t>
+        <w:t xml:space="preserve">Example 12: Range 3</w:t>
       </w:r>
     </w:p>
     <w:p>
@@ -2605,7 +2788,23 @@
           <w:sz w:val="40"/>
           <w:szCs w:val="40"/>
         </w:rPr>
-        <w:t xml:space="preserve">h(x)=arctan(x)</w:t>
+        <w:t xml:space="preserve">g(x)=</w:t>
+      </w:r>
+      <w:r>
+        <w:rPr>
+          <w:sz w:val="40"/>
+          <w:szCs w:val="40"/>
+        </w:rPr>
+        <w:t xml:space="preserve">arccos</w:t>
+      </w:r>
+      <w:r>
+        <w:rPr>
+          <w:i/>
+          <w:iCs/>
+          <w:sz w:val="40"/>
+          <w:szCs w:val="40"/>
+        </w:rPr>
+        <w:t xml:space="preserve">(x)</w:t>
       </w:r>
     </w:p>
     <w:p>
@@ -2622,7 +2821,7 @@
         <w:spacing w:after="120" w:before="80" w:line="300"/>
       </w:pPr>
       <w:r>
-        <w:t xml:space="preserve">What is the domain of this function?</w:t>
+        <w:t xml:space="preserve">What is the range of this function?</w:t>
       </w:r>
     </w:p>
     <w:p>
@@ -2642,7 +2841,7 @@
           <w:i/>
           <w:iCs/>
         </w:rPr>
-        <w:t xml:space="preserve">[−1,1]</w:t>
+        <w:t xml:space="preserve">[−π/2,π/2]</w:t>
       </w:r>
     </w:p>
     <w:p>
@@ -2662,7 +2861,7 @@
           <w:i/>
           <w:iCs/>
         </w:rPr>
-        <w:t xml:space="preserve">(−π/2,π/2)</w:t>
+        <w:t xml:space="preserve">[0,π]</w:t>
       </w:r>
     </w:p>
     <w:p>
@@ -2682,7 +2881,7 @@
           <w:i/>
           <w:iCs/>
         </w:rPr>
-        <w:t xml:space="preserve">[0,∞)</w:t>
+        <w:t xml:space="preserve">[0,2π)</w:t>
       </w:r>
     </w:p>
     <w:p>
@@ -2702,7 +2901,7 @@
           <w:i/>
           <w:iCs/>
         </w:rPr>
-        <w:t xml:space="preserve">(−∞,∞)</w:t>
+        <w:t xml:space="preserve">(0,π)</w:t>
       </w:r>
     </w:p>
     <w:p>
@@ -2719,83 +2918,89 @@
         <w:spacing w:after="120" w:before="80" w:line="300"/>
       </w:pPr>
       <w:r>
-        <w:t xml:space="preserve">Tangent can be any real number, so arctangent accepts any input: </w:t>
-      </w:r>
-      <w:r>
-        <w:rPr>
-          <w:i/>
-          <w:iCs/>
-        </w:rPr>
-        <w:t xml:space="preserve">arctan(1000)</w:t>
-      </w:r>
-      <w:r>
-        <w:t xml:space="preserve"> is just an angle a little less than </w:t>
-      </w:r>
-      <w:r>
-        <w:rPr>
-          <w:i/>
-          <w:iCs/>
-        </w:rPr>
-        <w:t xml:space="preserve">π/2</w:t>
-      </w:r>
-      <w:r>
-        <w:t xml:space="preserve">. Only arcsine and arccosine are limited to inputs from </w:t>
-      </w:r>
-      <w:r>
-        <w:rPr>
-          <w:i/>
-          <w:iCs/>
-        </w:rPr>
-        <w:t xml:space="preserve">−1</w:t>
-      </w:r>
-      <w:r>
-        <w:t xml:space="preserve"> to </w:t>
-      </w:r>
-      <w:r>
-        <w:rPr>
-          <w:i/>
-          <w:iCs/>
-        </w:rPr>
-        <w:t xml:space="preserve">1</w:t>
-      </w:r>
-      <w:r>
-        <w:t xml:space="preserve">. The open interval from </w:t>
-      </w:r>
-      <w:r>
-        <w:rPr>
-          <w:i/>
-          <w:iCs/>
-        </w:rPr>
-        <w:t xml:space="preserve">−π/2</w:t>
-      </w:r>
-      <w:r>
-        <w:t xml:space="preserve"> to </w:t>
-      </w:r>
-      <w:r>
-        <w:rPr>
-          <w:i/>
-          <w:iCs/>
-        </w:rPr>
-        <w:t xml:space="preserve">π/2</w:t>
-      </w:r>
-      <w:r>
-        <w:t xml:space="preserve"> is the range. </w:t>
-      </w:r>
-      <w:r>
-        <w:rPr>
-          <w:b/>
-          <w:bCs/>
-        </w:rPr>
-        <w:t xml:space="preserve">The domain is all real numbers, </w:t>
-      </w:r>
-      <w:r>
-        <w:rPr>
-          <w:b/>
-          <w:bCs/>
-          <w:i/>
-          <w:iCs/>
-        </w:rPr>
-        <w:t xml:space="preserve">(−∞,∞)</w:t>
+        <w:t xml:space="preserve">Arccosine gives angles on the top half of the circle, from 0 to </w:t>
+      </w:r>
+      <w:r>
+        <w:rPr>
+          <w:i/>
+          <w:iCs/>
+        </w:rPr>
+        <w:t xml:space="preserve">π</w:t>
+      </w:r>
+      <w:r>
+        <w:t xml:space="preserve">, and it reaches both ends: </w:t>
+      </w:r>
+      <w:r>
+        <w:t xml:space="preserve">arccos</w:t>
+      </w:r>
+      <w:r>
+        <w:rPr>
+          <w:i/>
+          <w:iCs/>
+        </w:rPr>
+        <w:t xml:space="preserve">(1)=0</w:t>
+      </w:r>
+      <w:r>
+        <w:t xml:space="preserve"> and </w:t>
+      </w:r>
+      <w:r>
+        <w:t xml:space="preserve">arccos</w:t>
+      </w:r>
+      <w:r>
+        <w:rPr>
+          <w:i/>
+          <w:iCs/>
+        </w:rPr>
+        <w:t xml:space="preserve">(−1)=π</w:t>
+      </w:r>
+      <w:r>
+        <w:t xml:space="preserve">. So the brackets are square. </w:t>
+      </w:r>
+      <w:r>
+        <w:rPr>
+          <w:i/>
+          <w:iCs/>
+        </w:rPr>
+        <w:t xml:space="preserve">[−π/2,π/2]</w:t>
+      </w:r>
+      <w:r>
+        <w:t xml:space="preserve"> is the right half, which would give negative angles, and arccosine is never negative; </w:t>
+      </w:r>
+      <w:r>
+        <w:rPr>
+          <w:i/>
+          <w:iCs/>
+        </w:rPr>
+        <w:t xml:space="preserve">[0,2π)</w:t>
+      </w:r>
+      <w:r>
+        <w:t xml:space="preserve"> is the whole circle, but each input gets just one angle; and </w:t>
+      </w:r>
+      <w:r>
+        <w:rPr>
+          <w:i/>
+          <w:iCs/>
+        </w:rPr>
+        <w:t xml:space="preserve">(0,π)</w:t>
+      </w:r>
+      <w:r>
+        <w:t xml:space="preserve"> leaves out the ends, which are reached. </w:t>
+      </w:r>
+      <w:r>
+        <w:rPr>
+          <w:b/>
+          <w:bCs/>
+        </w:rPr>
+        <w:t xml:space="preserve">The range is </w:t>
+      </w:r>
+      <w:r>
+        <w:rPr>
+          <w:b/>
+          <w:bCs/>
+          <w:i/>
+          <w:iCs/>
+        </w:rPr>
+        <w:t xml:space="preserve">[0,π]</w:t>
       </w:r>
       <w:r>
         <w:rPr>
@@ -2914,7 +3119,17 @@
           <w:i/>
           <w:iCs/>
         </w:rPr>
-        <w:t xml:space="preserve">y=arccos(x)</w:t>
+        <w:t xml:space="preserve">y=</w:t>
+      </w:r>
+      <w:r>
+        <w:t xml:space="preserve">arccos</w:t>
+      </w:r>
+      <w:r>
+        <w:rPr>
+          <w:i/>
+          <w:iCs/>
+        </w:rPr>
+        <w:t xml:space="preserve">(x)</w:t>
       </w:r>
     </w:p>
     <w:p>
@@ -2934,7 +3149,17 @@
           <w:i/>
           <w:iCs/>
         </w:rPr>
-        <w:t xml:space="preserve">y=arctan(x)</w:t>
+        <w:t xml:space="preserve">y=</w:t>
+      </w:r>
+      <w:r>
+        <w:t xml:space="preserve">arctan</w:t>
+      </w:r>
+      <w:r>
+        <w:rPr>
+          <w:i/>
+          <w:iCs/>
+        </w:rPr>
+        <w:t xml:space="preserve">(x)</w:t>
       </w:r>
     </w:p>
     <w:p>
@@ -2984,7 +3209,17 @@
           <w:i/>
           <w:iCs/>
         </w:rPr>
-        <w:t xml:space="preserve">y=arcsin(x)</w:t>
+        <w:t xml:space="preserve">y=</w:t>
+      </w:r>
+      <w:r>
+        <w:t xml:space="preserve">arcsin</w:t>
+      </w:r>
+      <w:r>
+        <w:rPr>
+          <w:i/>
+          <w:iCs/>
+        </w:rPr>
+        <w:t xml:space="preserve">(x)</w:t>
       </w:r>
     </w:p>
     <w:p>
@@ -3031,24 +3266,17 @@
         <w:t xml:space="preserve">(0, 0)</w:t>
       </w:r>
       <w:r>
-        <w:t xml:space="preserve">: </w:t>
-      </w:r>
-      <w:r>
-        <w:rPr>
-          <w:i/>
-          <w:iCs/>
-        </w:rPr>
-        <w:t xml:space="preserve">arcsin(0)=0</w:t>
-      </w:r>
-      <w:r>
-        <w:t xml:space="preserve">, while </w:t>
-      </w:r>
-      <w:r>
-        <w:rPr>
-          <w:i/>
-          <w:iCs/>
-        </w:rPr>
-        <w:t xml:space="preserve">arccos(0)=π/2</w:t>
+        <w:t xml:space="preserve">, and </w:t>
+      </w:r>
+      <w:r>
+        <w:t xml:space="preserve">arcsin</w:t>
+      </w:r>
+      <w:r>
+        <w:rPr>
+          <w:i/>
+          <w:iCs/>
+        </w:rPr>
+        <w:t xml:space="preserve">(0)=0</w:t>
       </w:r>
       <w:r>
         <w:t xml:space="preserve">. The outputs run from </w:t>
@@ -3071,7 +3299,17 @@
         <w:t xml:space="preserve">π/2</w:t>
       </w:r>
       <w:r>
-        <w:t xml:space="preserve">, the range of arcsine. Sine would repeat forever left and right. </w:t>
+        <w:t xml:space="preserve">, the range of arcsine. Arccosine is never negative, but this curve goes below the </w:t>
+      </w:r>
+      <w:r>
+        <w:rPr>
+          <w:i/>
+          <w:iCs/>
+        </w:rPr>
+        <w:t xml:space="preserve">x</w:t>
+      </w:r>
+      <w:r>
+        <w:t xml:space="preserve">-axis; arctangent would accept every input; and sine would repeat forever left and right. </w:t>
       </w:r>
       <w:r>
         <w:rPr>
@@ -3087,7 +3325,23 @@
           <w:i/>
           <w:iCs/>
         </w:rPr>
-        <w:t xml:space="preserve">y=arcsin(x)</w:t>
+        <w:t xml:space="preserve">y=</w:t>
+      </w:r>
+      <w:r>
+        <w:rPr>
+          <w:b/>
+          <w:bCs/>
+        </w:rPr>
+        <w:t xml:space="preserve">arcsin</w:t>
+      </w:r>
+      <w:r>
+        <w:rPr>
+          <w:b/>
+          <w:bCs/>
+          <w:i/>
+          <w:iCs/>
+        </w:rPr>
+        <w:t xml:space="preserve">(x)</w:t>
       </w:r>
       <w:r>
         <w:rPr>
@@ -3113,7 +3367,7 @@
       <w:r>
         <w:drawing>
           <wp:inline distT="0" distB="0" distL="0" distR="0">
-            <wp:extent cx="2324100" cy="2476500"/>
+            <wp:extent cx="2333625" cy="2476500"/>
             <wp:effectExtent t="0" r="0" b="0" l="0"/>
             <wp:docPr id="1" name="graph2" descr="A falling curve between two solid end dots, with three labeled points. Plotted data: a curve that exists only from x = −1 to x = 1, with solid dots at both ends: (−1, π) and (1, 0). It passes through (0, π/2) and falls from left to right. It is steepest near its two ends. Nothing is drawn to the left of x = −1 or to the right of x = 1." title="A falling curve between two solid end dots, with three labeled points"/>
             <wp:cNvGraphicFramePr>
@@ -3138,7 +3392,7 @@
                   <pic:spPr bwMode="auto">
                     <a:xfrm>
                       <a:off x="0" y="0"/>
-                      <a:ext cx="2324100" cy="2476500"/>
+                      <a:ext cx="2333625" cy="2476500"/>
                     </a:xfrm>
                     <a:prstGeom prst="rect">
                       <a:avLst/>
@@ -3206,7 +3460,17 @@
           <w:i/>
           <w:iCs/>
         </w:rPr>
-        <w:t xml:space="preserve">y=arccos(x)</w:t>
+        <w:t xml:space="preserve">y=</w:t>
+      </w:r>
+      <w:r>
+        <w:t xml:space="preserve">arccos</w:t>
+      </w:r>
+      <w:r>
+        <w:rPr>
+          <w:i/>
+          <w:iCs/>
+        </w:rPr>
+        <w:t xml:space="preserve">(x)</w:t>
       </w:r>
     </w:p>
     <w:p>
@@ -3226,7 +3490,17 @@
           <w:i/>
           <w:iCs/>
         </w:rPr>
-        <w:t xml:space="preserve">y=arcsin(x)</w:t>
+        <w:t xml:space="preserve">y=</w:t>
+      </w:r>
+      <w:r>
+        <w:t xml:space="preserve">arcsin</w:t>
+      </w:r>
+      <w:r>
+        <w:rPr>
+          <w:i/>
+          <w:iCs/>
+        </w:rPr>
+        <w:t xml:space="preserve">(x)</w:t>
       </w:r>
     </w:p>
     <w:p>
@@ -3246,7 +3520,17 @@
           <w:i/>
           <w:iCs/>
         </w:rPr>
-        <w:t xml:space="preserve">y=arctan(x)</w:t>
+        <w:t xml:space="preserve">y=</w:t>
+      </w:r>
+      <w:r>
+        <w:t xml:space="preserve">arctan</w:t>
+      </w:r>
+      <w:r>
+        <w:rPr>
+          <w:i/>
+          <w:iCs/>
+        </w:rPr>
+        <w:t xml:space="preserve">(x)</w:t>
       </w:r>
     </w:p>
     <w:p>
@@ -3269,14 +3553,14 @@
         <w:t xml:space="preserve">y=</w:t>
       </w:r>
       <w:r>
-        <w:t xml:space="preserve">sin</w:t>
-      </w:r>
-      <w:r>
-        <w:rPr>
-          <w:i/>
-          <w:iCs/>
-        </w:rPr>
-        <w:t xml:space="preserve">(x)</w:t>
+        <w:t xml:space="preserve">arcsin</w:t>
+      </w:r>
+      <w:r>
+        <w:rPr>
+          <w:i/>
+          <w:iCs/>
+        </w:rPr>
+        <w:t xml:space="preserve">(x)+π/2</w:t>
       </w:r>
     </w:p>
     <w:p>
@@ -3326,34 +3610,66 @@
         <w:t xml:space="preserve">, never negative. That is the range of arccosine. Check the points: </w:t>
       </w:r>
       <w:r>
-        <w:rPr>
-          <w:i/>
-          <w:iCs/>
-        </w:rPr>
-        <w:t xml:space="preserve">arccos(1)=0</w:t>
+        <w:t xml:space="preserve">arccos</w:t>
+      </w:r>
+      <w:r>
+        <w:rPr>
+          <w:i/>
+          <w:iCs/>
+        </w:rPr>
+        <w:t xml:space="preserve">(1)=0</w:t>
       </w:r>
       <w:r>
         <w:t xml:space="preserve">, </w:t>
       </w:r>
       <w:r>
-        <w:rPr>
-          <w:i/>
-          <w:iCs/>
-        </w:rPr>
-        <w:t xml:space="preserve">arccos(0)=π/2</w:t>
+        <w:t xml:space="preserve">arccos</w:t>
+      </w:r>
+      <w:r>
+        <w:rPr>
+          <w:i/>
+          <w:iCs/>
+        </w:rPr>
+        <w:t xml:space="preserve">(0)=π/2</w:t>
       </w:r>
       <w:r>
         <w:t xml:space="preserve">, and </w:t>
       </w:r>
       <w:r>
-        <w:rPr>
-          <w:i/>
-          <w:iCs/>
-        </w:rPr>
-        <w:t xml:space="preserve">arccos(−1)=π</w:t>
-      </w:r>
-      <w:r>
-        <w:t xml:space="preserve">. Arcsine would rise instead. </w:t>
+        <w:t xml:space="preserve">arccos</w:t>
+      </w:r>
+      <w:r>
+        <w:rPr>
+          <w:i/>
+          <w:iCs/>
+        </w:rPr>
+        <w:t xml:space="preserve">(−1)=π</w:t>
+      </w:r>
+      <w:r>
+        <w:t xml:space="preserve">. Arcsine and arctangent both give negative outputs for negative inputs, and arctangent accepts every input. </w:t>
+      </w:r>
+      <w:r>
+        <w:t xml:space="preserve">arcsin</w:t>
+      </w:r>
+      <w:r>
+        <w:rPr>
+          <w:i/>
+          <w:iCs/>
+        </w:rPr>
+        <w:t xml:space="preserve">(x)+π/2</w:t>
+      </w:r>
+      <w:r>
+        <w:t xml:space="preserve"> also has outputs from 0 to </w:t>
+      </w:r>
+      <w:r>
+        <w:rPr>
+          <w:i/>
+          <w:iCs/>
+        </w:rPr>
+        <w:t xml:space="preserve">π</w:t>
+      </w:r>
+      <w:r>
+        <w:t xml:space="preserve">, but it rises from left to right, and this curve falls. </w:t>
       </w:r>
       <w:r>
         <w:rPr>
@@ -3369,7 +3685,23 @@
           <w:i/>
           <w:iCs/>
         </w:rPr>
-        <w:t xml:space="preserve">y=arccos(x)</w:t>
+        <w:t xml:space="preserve">y=</w:t>
+      </w:r>
+      <w:r>
+        <w:rPr>
+          <w:b/>
+          <w:bCs/>
+        </w:rPr>
+        <w:t xml:space="preserve">arccos</w:t>
+      </w:r>
+      <w:r>
+        <w:rPr>
+          <w:b/>
+          <w:bCs/>
+          <w:i/>
+          <w:iCs/>
+        </w:rPr>
+        <w:t xml:space="preserve">(x)</w:t>
       </w:r>
       <w:r>
         <w:rPr>
@@ -3395,9 +3727,9 @@
       <w:r>
         <w:drawing>
           <wp:inline distT="0" distB="0" distL="0" distR="0">
-            <wp:extent cx="3695700" cy="2476500"/>
+            <wp:extent cx="3705225" cy="2476500"/>
             <wp:effectExtent t="0" r="0" b="0" l="0"/>
-            <wp:docPr id="1" name="graph3" descr="A rising curve between two dashed horizontal lines, with three labeled points. Plotted data: dashed horizontal lines at y = −π/2 and y = π/2. A curve runs across the whole grid, from x = −4 to x = 4, rising from left to right. It passes through (−1, −π/4), (0, 0), and (1, π/4). Far to the left it comes very close to the lower dashed line, and far to the right very close to the upper one, without touching either." title="A rising curve between two dashed horizontal lines, with three labeled points"/>
+            <wp:docPr id="1" name="graph3" descr="A rising curve between two dashed horizontal lines, with three labeled points. Plotted data: dashed horizontal lines at y = −π/2 and y = π/2. A curve runs across the whole grid, from x = −4 to x = 4, rising from left to right. It passes through (−1, −π/4), (0, 0), and (1, π/4). Toward the left it levels off, approaching the lower dashed line, and toward the right it approaches the upper one, without touching either." title="A rising curve between two dashed horizontal lines, with three labeled points"/>
             <wp:cNvGraphicFramePr>
               <a:graphicFrameLocks xmlns:a="http://schemas.openxmlformats.org/drawingml/2006/main" noChangeAspect="1"/>
             </wp:cNvGraphicFramePr>
@@ -3420,7 +3752,7 @@
                   <pic:spPr bwMode="auto">
                     <a:xfrm>
                       <a:off x="0" y="0"/>
-                      <a:ext cx="3695700" cy="2476500"/>
+                      <a:ext cx="3705225" cy="2476500"/>
                     </a:xfrm>
                     <a:prstGeom prst="rect">
                       <a:avLst/>
@@ -3451,7 +3783,7 @@
           <w:sz w:val="22"/>
           <w:szCs w:val="22"/>
         </w:rPr>
-        <w:t xml:space="preserve">dashed horizontal lines at y = −π/2 and y = π/2. A curve runs across the whole grid, from x = −4 to x = 4, rising from left to right. It passes through (−1, −π/4), (0, 0), and (1, π/4). Far to the left it comes very close to the lower dashed line, and far to the right very close to the upper one, without touching either.</w:t>
+        <w:t xml:space="preserve">dashed horizontal lines at y = −π/2 and y = π/2. A curve runs across the whole grid, from x = −4 to x = 4, rising from left to right. It passes through (−1, −π/4), (0, 0), and (1, π/4). Toward the left it levels off, approaching the lower dashed line, and toward the right it approaches the upper one, without touching either.</w:t>
       </w:r>
     </w:p>
     <w:p>
@@ -3488,7 +3820,17 @@
           <w:i/>
           <w:iCs/>
         </w:rPr>
-        <w:t xml:space="preserve">y=arcsin(x)</w:t>
+        <w:t xml:space="preserve">y=</w:t>
+      </w:r>
+      <w:r>
+        <w:t xml:space="preserve">arcsin</w:t>
+      </w:r>
+      <w:r>
+        <w:rPr>
+          <w:i/>
+          <w:iCs/>
+        </w:rPr>
+        <w:t xml:space="preserve">(x)</w:t>
       </w:r>
     </w:p>
     <w:p>
@@ -3538,7 +3880,17 @@
           <w:i/>
           <w:iCs/>
         </w:rPr>
-        <w:t xml:space="preserve">y=arctan(x)</w:t>
+        <w:t xml:space="preserve">y=</w:t>
+      </w:r>
+      <w:r>
+        <w:t xml:space="preserve">arctan</w:t>
+      </w:r>
+      <w:r>
+        <w:rPr>
+          <w:i/>
+          <w:iCs/>
+        </w:rPr>
+        <w:t xml:space="preserve">(x)</w:t>
       </w:r>
     </w:p>
     <w:p>
@@ -3558,7 +3910,17 @@
           <w:i/>
           <w:iCs/>
         </w:rPr>
-        <w:t xml:space="preserve">y=arccos(x)</w:t>
+        <w:t xml:space="preserve">y=</w:t>
+      </w:r>
+      <w:r>
+        <w:t xml:space="preserve">arccos</w:t>
+      </w:r>
+      <w:r>
+        <w:rPr>
+          <w:i/>
+          <w:iCs/>
+        </w:rPr>
+        <w:t xml:space="preserve">(x)</w:t>
       </w:r>
     </w:p>
     <w:p>
@@ -3608,11 +3970,14 @@
         <w:t xml:space="preserve"> without reaching them, which is the range of arctangent. Check: </w:t>
       </w:r>
       <w:r>
-        <w:rPr>
-          <w:i/>
-          <w:iCs/>
-        </w:rPr>
-        <w:t xml:space="preserve">arctan(1)=π/4</w:t>
+        <w:t xml:space="preserve">arctan</w:t>
+      </w:r>
+      <w:r>
+        <w:rPr>
+          <w:i/>
+          <w:iCs/>
+        </w:rPr>
+        <w:t xml:space="preserve">(1)=π/4</w:t>
       </w:r>
       <w:r>
         <w:t xml:space="preserve">. Sine would wave up and down between </w:t>
@@ -3635,7 +4000,7 @@
         <w:t xml:space="preserve">1</w:t>
       </w:r>
       <w:r>
-        <w:t xml:space="preserve">. </w:t>
+        <w:t xml:space="preserve"> forever. </w:t>
       </w:r>
       <w:r>
         <w:rPr>
@@ -3651,7 +4016,23 @@
           <w:i/>
           <w:iCs/>
         </w:rPr>
-        <w:t xml:space="preserve">y=arctan(x)</w:t>
+        <w:t xml:space="preserve">y=</w:t>
+      </w:r>
+      <w:r>
+        <w:rPr>
+          <w:b/>
+          <w:bCs/>
+        </w:rPr>
+        <w:t xml:space="preserve">arctan</w:t>
+      </w:r>
+      <w:r>
+        <w:rPr>
+          <w:b/>
+          <w:bCs/>
+          <w:i/>
+          <w:iCs/>
+        </w:rPr>
+        <w:t xml:space="preserve">(x)</w:t>
       </w:r>
       <w:r>
         <w:rPr>
@@ -3677,12 +4058,19 @@
       </w:pPr>
       <w:r>
         <w:rPr>
-          <w:i/>
-          <w:iCs/>
           <w:sz w:val="40"/>
           <w:szCs w:val="40"/>
         </w:rPr>
-        <w:t xml:space="preserve">arcsin((√3)/2)=(2π)/3</w:t>
+        <w:t xml:space="preserve">arcsin</w:t>
+      </w:r>
+      <w:r>
+        <w:rPr>
+          <w:i/>
+          <w:iCs/>
+          <w:sz w:val="40"/>
+          <w:szCs w:val="40"/>
+        </w:rPr>
+        <w:t xml:space="preserve">(√3/2)=2π/3</w:t>
       </w:r>
     </w:p>
     <w:p>
@@ -3709,7 +4097,7 @@
           <w:i/>
           <w:iCs/>
         </w:rPr>
-        <w:t xml:space="preserve">((2π)/3)=(√3)/2</w:t>
+        <w:t xml:space="preserve">(2π/3)=√3/2</w:t>
       </w:r>
       <w:r>
         <w:t xml:space="preserve">. What is the mistake, if any?</w:t>
@@ -3728,6 +4116,64 @@
         <w:t xml:space="preserve">A.  </w:t>
       </w:r>
       <w:r>
+        <w:t xml:space="preserve">There is no mistake.</w:t>
+      </w:r>
+    </w:p>
+    <w:p>
+      <w:pPr>
+        <w:spacing w:after="40" w:before="20"/>
+        <w:ind w:left="360"/>
+      </w:pPr>
+      <w:r>
+        <w:rPr>
+          <w:b/>
+          <w:bCs/>
+        </w:rPr>
+        <w:t xml:space="preserve">B.  </w:t>
+      </w:r>
+      <w:r>
+        <w:t xml:space="preserve">The sine of that angle is really one half, so the angle is wrong.</w:t>
+      </w:r>
+    </w:p>
+    <w:p>
+      <w:pPr>
+        <w:spacing w:after="40" w:before="20"/>
+        <w:ind w:left="360"/>
+      </w:pPr>
+      <w:r>
+        <w:rPr>
+          <w:b/>
+          <w:bCs/>
+        </w:rPr>
+        <w:t xml:space="preserve">C.  </w:t>
+      </w:r>
+      <w:r>
+        <w:t xml:space="preserve">The other angle with this sine works instead: </w:t>
+      </w:r>
+      <w:r>
+        <w:rPr>
+          <w:i/>
+          <w:iCs/>
+        </w:rPr>
+        <w:t xml:space="preserve">4π/3</w:t>
+      </w:r>
+      <w:r>
+        <w:t xml:space="preserve">.</w:t>
+      </w:r>
+    </w:p>
+    <w:p>
+      <w:pPr>
+        <w:spacing w:after="40" w:before="20"/>
+        <w:ind w:left="360"/>
+      </w:pPr>
+      <w:r>
+        <w:rPr>
+          <w:b/>
+          <w:bCs/>
+        </w:rPr>
+        <w:t xml:space="preserve">D.  </w:t>
+      </w:r>
+      <w:r>
         <w:t xml:space="preserve">Arcsine stays on the right half, so the answer is </w:t>
       </w:r>
       <w:r>
@@ -3739,64 +4185,6 @@
       </w:r>
       <w:r>
         <w:t xml:space="preserve">.</w:t>
-      </w:r>
-    </w:p>
-    <w:p>
-      <w:pPr>
-        <w:spacing w:after="40" w:before="20"/>
-        <w:ind w:left="360"/>
-      </w:pPr>
-      <w:r>
-        <w:rPr>
-          <w:b/>
-          <w:bCs/>
-        </w:rPr>
-        <w:t xml:space="preserve">B.  </w:t>
-      </w:r>
-      <w:r>
-        <w:t xml:space="preserve">The sine of that angle is really one half, so the angle is wrong.</w:t>
-      </w:r>
-    </w:p>
-    <w:p>
-      <w:pPr>
-        <w:spacing w:after="40" w:before="20"/>
-        <w:ind w:left="360"/>
-      </w:pPr>
-      <w:r>
-        <w:rPr>
-          <w:b/>
-          <w:bCs/>
-        </w:rPr>
-        <w:t xml:space="preserve">C.  </w:t>
-      </w:r>
-      <w:r>
-        <w:t xml:space="preserve">The other angle with this sine works instead: </w:t>
-      </w:r>
-      <w:r>
-        <w:rPr>
-          <w:i/>
-          <w:iCs/>
-        </w:rPr>
-        <w:t xml:space="preserve">(4π)/3</w:t>
-      </w:r>
-      <w:r>
-        <w:t xml:space="preserve">.</w:t>
-      </w:r>
-    </w:p>
-    <w:p>
-      <w:pPr>
-        <w:spacing w:after="40" w:before="20"/>
-        <w:ind w:left="360"/>
-      </w:pPr>
-      <w:r>
-        <w:rPr>
-          <w:b/>
-          <w:bCs/>
-        </w:rPr>
-        <w:t xml:space="preserve">D.  </w:t>
-      </w:r>
-      <w:r>
-        <w:t xml:space="preserve">There is no mistake.</w:t>
       </w:r>
     </w:p>
     <w:p>
@@ -3813,7 +4201,7 @@
         <w:spacing w:after="120" w:before="80" w:line="300"/>
       </w:pPr>
       <w:r>
-        <w:t xml:space="preserve">It is true that </w:t>
+        <w:t xml:space="preserve">The student's fact is right: </w:t>
       </w:r>
       <w:r>
         <w:t xml:space="preserve">sin</w:t>
@@ -3823,17 +4211,17 @@
           <w:i/>
           <w:iCs/>
         </w:rPr>
-        <w:t xml:space="preserve">((2π)/3)=(√3)/2</w:t>
-      </w:r>
-      <w:r>
-        <w:t xml:space="preserve">, but </w:t>
-      </w:r>
-      <w:r>
-        <w:rPr>
-          <w:i/>
-          <w:iCs/>
-        </w:rPr>
-        <w:t xml:space="preserve">(2π)/3</w:t>
+        <w:t xml:space="preserve">(2π/3)=√3/2</w:t>
+      </w:r>
+      <w:r>
+        <w:t xml:space="preserve">, not one half. But </w:t>
+      </w:r>
+      <w:r>
+        <w:rPr>
+          <w:i/>
+          <w:iCs/>
+        </w:rPr>
+        <w:t xml:space="preserve">2π/3</w:t>
       </w:r>
       <w:r>
         <w:t xml:space="preserve"> is outside arcsine's range. Arcsine picks the one angle on the right half of the circle with that sine. The sine of </w:t>
@@ -3843,7 +4231,7 @@
           <w:i/>
           <w:iCs/>
         </w:rPr>
-        <w:t xml:space="preserve">(4π)/3</w:t>
+        <w:t xml:space="preserve">4π/3</w:t>
       </w:r>
       <w:r>
         <w:t xml:space="preserve"> is negative. </w:t>
@@ -3888,12 +4276,19 @@
       </w:pPr>
       <w:r>
         <w:rPr>
-          <w:i/>
-          <w:iCs/>
           <w:sz w:val="40"/>
           <w:szCs w:val="40"/>
         </w:rPr>
-        <w:t xml:space="preserve">arccos(−(√2)/2)=−π/4</w:t>
+        <w:t xml:space="preserve">arccos</w:t>
+      </w:r>
+      <w:r>
+        <w:rPr>
+          <w:i/>
+          <w:iCs/>
+          <w:sz w:val="40"/>
+          <w:szCs w:val="40"/>
+        </w:rPr>
+        <w:t xml:space="preserve">(−√2/2)=−π/4</w:t>
       </w:r>
     </w:p>
     <w:p>
@@ -3949,7 +4344,7 @@
           <w:i/>
           <w:iCs/>
         </w:rPr>
-        <w:t xml:space="preserve">(5π)/4</w:t>
+        <w:t xml:space="preserve">5π/4</w:t>
       </w:r>
       <w:r>
         <w:t xml:space="preserve">.</w:t>
@@ -3975,7 +4370,7 @@
           <w:i/>
           <w:iCs/>
         </w:rPr>
-        <w:t xml:space="preserve">(3π)/4</w:t>
+        <w:t xml:space="preserve">3π/4</w:t>
       </w:r>
       <w:r>
         <w:t xml:space="preserve">.</w:t>
@@ -4038,7 +4433,7 @@
           <w:i/>
           <w:iCs/>
         </w:rPr>
-        <w:t xml:space="preserve">(3π)/4</w:t>
+        <w:t xml:space="preserve">3π/4</w:t>
       </w:r>
       <w:r>
         <w:t xml:space="preserve">. The student used arcsine's rule. The angle </w:t>
@@ -4048,10 +4443,20 @@
           <w:i/>
           <w:iCs/>
         </w:rPr>
-        <w:t xml:space="preserve">(5π)/4</w:t>
-      </w:r>
-      <w:r>
-        <w:t xml:space="preserve"> is on the bottom half. </w:t>
+        <w:t xml:space="preserve">5π/4</w:t>
+      </w:r>
+      <w:r>
+        <w:t xml:space="preserve"> is on the bottom half, and ignoring the sign gives </w:t>
+      </w:r>
+      <w:r>
+        <w:rPr>
+          <w:i/>
+          <w:iCs/>
+        </w:rPr>
+        <w:t xml:space="preserve">π/4</w:t>
+      </w:r>
+      <w:r>
+        <w:t xml:space="preserve">, whose cosine is positive. </w:t>
       </w:r>
       <w:r>
         <w:rPr>
@@ -4067,7 +4472,7 @@
           <w:i/>
           <w:iCs/>
         </w:rPr>
-        <w:t xml:space="preserve">(3π)/4</w:t>
+        <w:t xml:space="preserve">3π/4</w:t>
       </w:r>
       <w:r>
         <w:rPr>
@@ -4093,12 +4498,19 @@
       </w:pPr>
       <w:r>
         <w:rPr>
-          <w:i/>
-          <w:iCs/>
           <w:sz w:val="40"/>
           <w:szCs w:val="40"/>
         </w:rPr>
-        <w:t xml:space="preserve">arcsin(2)</w:t>
+        <w:t xml:space="preserve">arcsin</w:t>
+      </w:r>
+      <w:r>
+        <w:rPr>
+          <w:i/>
+          <w:iCs/>
+          <w:sz w:val="40"/>
+          <w:szCs w:val="40"/>
+        </w:rPr>
+        <w:t xml:space="preserve">(2)</w:t>
       </w:r>
     </w:p>
     <w:p>
@@ -4131,6 +4543,22 @@
         <w:t xml:space="preserve">A.  </w:t>
       </w:r>
       <w:r>
+        <w:t xml:space="preserve">There is no mistake.</w:t>
+      </w:r>
+    </w:p>
+    <w:p>
+      <w:pPr>
+        <w:spacing w:after="40" w:before="20"/>
+        <w:ind w:left="360"/>
+      </w:pPr>
+      <w:r>
+        <w:rPr>
+          <w:b/>
+          <w:bCs/>
+        </w:rPr>
+        <w:t xml:space="preserve">B.  </w:t>
+      </w:r>
+      <w:r>
         <w:t xml:space="preserve">Since 2 is close to 1, it equals </w:t>
       </w:r>
       <w:r>
@@ -4154,26 +4582,10 @@
           <w:b/>
           <w:bCs/>
         </w:rPr>
-        <w:t xml:space="preserve">B.  </w:t>
-      </w:r>
-      <w:r>
-        <w:t xml:space="preserve">There is no mistake.</w:t>
-      </w:r>
-    </w:p>
-    <w:p>
-      <w:pPr>
-        <w:spacing w:after="40" w:before="20"/>
-        <w:ind w:left="360"/>
-      </w:pPr>
-      <w:r>
-        <w:rPr>
-          <w:b/>
-          <w:bCs/>
-        </w:rPr>
         <w:t xml:space="preserve">C.  </w:t>
       </w:r>
       <w:r>
-        <w:t xml:space="preserve">It equals one divided by the sine of 2.</w:t>
+        <w:t xml:space="preserve">It equals sin(2), which is about 0.91.</w:t>
       </w:r>
     </w:p>
     <w:p>
@@ -4226,7 +4638,40 @@
         <w:t xml:space="preserve">[−1,1]</w:t>
       </w:r>
       <w:r>
-        <w:t xml:space="preserve">, and 2 is outside it. The student is right. Arcsine is not one divided by sine. </w:t>
+        <w:t xml:space="preserve">, and 2 is outside it. The student is right. </w:t>
+      </w:r>
+      <w:r>
+        <w:rPr>
+          <w:i/>
+          <w:iCs/>
+        </w:rPr>
+        <w:t xml:space="preserve">π/2</w:t>
+      </w:r>
+      <w:r>
+        <w:t xml:space="preserve"> has sine exactly 1, and close is not enough; </w:t>
+      </w:r>
+      <w:r>
+        <w:t xml:space="preserve">sin</w:t>
+      </w:r>
+      <w:r>
+        <w:rPr>
+          <w:i/>
+          <w:iCs/>
+        </w:rPr>
+        <w:t xml:space="preserve">(2)</w:t>
+      </w:r>
+      <w:r>
+        <w:t xml:space="preserve"> goes the wrong way, from an angle to a value; and a full turn, </w:t>
+      </w:r>
+      <w:r>
+        <w:rPr>
+          <w:i/>
+          <w:iCs/>
+        </w:rPr>
+        <w:t xml:space="preserve">2π</w:t>
+      </w:r>
+      <w:r>
+        <w:t xml:space="preserve">, has sine 0. </w:t>
       </w:r>
       <w:r>
         <w:rPr>
@@ -4257,7 +4702,23 @@
           <w:sz w:val="40"/>
           <w:szCs w:val="40"/>
         </w:rPr>
-        <w:t xml:space="preserve">h(x)=arctan(x)</w:t>
+        <w:t xml:space="preserve">h(x)=</w:t>
+      </w:r>
+      <w:r>
+        <w:rPr>
+          <w:sz w:val="40"/>
+          <w:szCs w:val="40"/>
+        </w:rPr>
+        <w:t xml:space="preserve">arctan</w:t>
+      </w:r>
+      <w:r>
+        <w:rPr>
+          <w:i/>
+          <w:iCs/>
+          <w:sz w:val="40"/>
+          <w:szCs w:val="40"/>
+        </w:rPr>
+        <w:t xml:space="preserve">(x)</w:t>
       </w:r>
     </w:p>
     <w:p>
@@ -4300,6 +4761,22 @@
         <w:t xml:space="preserve">A.  </w:t>
       </w:r>
       <w:r>
+        <w:t xml:space="preserve">There is no mistake.</w:t>
+      </w:r>
+    </w:p>
+    <w:p>
+      <w:pPr>
+        <w:spacing w:after="40" w:before="20"/>
+        <w:ind w:left="360"/>
+      </w:pPr>
+      <w:r>
+        <w:rPr>
+          <w:b/>
+          <w:bCs/>
+        </w:rPr>
+        <w:t xml:space="preserve">B.  </w:t>
+      </w:r>
+      <w:r>
         <w:t xml:space="preserve">The range should be all real numbers, like the domain.</w:t>
       </w:r>
     </w:p>
@@ -4313,7 +4790,7 @@
           <w:b/>
           <w:bCs/>
         </w:rPr>
-        <w:t xml:space="preserve">B.  </w:t>
+        <w:t xml:space="preserve">C.  </w:t>
       </w:r>
       <w:r>
         <w:t xml:space="preserve">The range should match arccosine, </w:t>
@@ -4327,22 +4804,6 @@
       </w:r>
       <w:r>
         <w:t xml:space="preserve">.</w:t>
-      </w:r>
-    </w:p>
-    <w:p>
-      <w:pPr>
-        <w:spacing w:after="40" w:before="20"/>
-        <w:ind w:left="360"/>
-      </w:pPr>
-      <w:r>
-        <w:rPr>
-          <w:b/>
-          <w:bCs/>
-        </w:rPr>
-        <w:t xml:space="preserve">C.  </w:t>
-      </w:r>
-      <w:r>
-        <w:t xml:space="preserve">There is no mistake.</w:t>
       </w:r>
     </w:p>
     <w:p>
@@ -4385,7 +4846,17 @@
         <w:t xml:space="preserve">±π/2</w:t>
       </w:r>
       <w:r>
-        <w:t xml:space="preserve">, so arctangent never outputs those angles. Its graph only levels off toward them. Leaving the ends out takes round brackets. All real numbers is the domain, not the range. </w:t>
+        <w:t xml:space="preserve">, so arctangent never outputs those angles. Its graph only levels off toward them. Leaving the ends out takes round brackets. All real numbers is the domain, not the range; and </w:t>
+      </w:r>
+      <w:r>
+        <w:rPr>
+          <w:i/>
+          <w:iCs/>
+        </w:rPr>
+        <w:t xml:space="preserve">[0,π]</w:t>
+      </w:r>
+      <w:r>
+        <w:t xml:space="preserve">, the top half, would leave out the negative angles that negative inputs give. </w:t>
       </w:r>
       <w:r>
         <w:rPr>
@@ -4449,7 +4920,7 @@
           <w:sz w:val="40"/>
           <w:szCs w:val="40"/>
         </w:rPr>
-        <w:t xml:space="preserve">(x)=1/(</w:t>
+        <w:t xml:space="preserve">(x)=1/</w:t>
       </w:r>
       <w:r>
         <w:rPr>
@@ -4465,7 +4936,7 @@
           <w:sz w:val="40"/>
           <w:szCs w:val="40"/>
         </w:rPr>
-        <w:t xml:space="preserve">(x))</w:t>
+        <w:t xml:space="preserve">(x)</w:t>
       </w:r>
     </w:p>
     <w:p>
@@ -4514,7 +4985,7 @@
         <w:t xml:space="preserve">B.  </w:t>
       </w:r>
       <w:r>
-        <w:t xml:space="preserve">The right side should be 1 over the cosine of x.</w:t>
+        <w:t xml:space="preserve">The right side should be 1 over the cosine of x instead.</w:t>
       </w:r>
     </w:p>
     <w:p>
@@ -4583,7 +5054,37 @@
         <w:t xml:space="preserve">π/2</w:t>
       </w:r>
       <w:r>
-        <w:t xml:space="preserve">, but one over sine of 1 is about 1.19. </w:t>
+        <w:t xml:space="preserve">, but one over sine of 1 is about 1.19. One over cosine is secant, and the negative of sine, </w:t>
+      </w:r>
+      <w:r>
+        <w:rPr>
+          <w:i/>
+          <w:iCs/>
+        </w:rPr>
+        <w:t xml:space="preserve">−</w:t>
+      </w:r>
+      <w:r>
+        <w:t xml:space="preserve">sin</w:t>
+      </w:r>
+      <w:r>
+        <w:rPr>
+          <w:i/>
+          <w:iCs/>
+        </w:rPr>
+        <w:t xml:space="preserve">(x)</w:t>
+      </w:r>
+      <w:r>
+        <w:t xml:space="preserve">, is a reflection of the sine graph; neither is what the </w:t>
+      </w:r>
+      <w:r>
+        <w:rPr>
+          <w:i/>
+          <w:iCs/>
+        </w:rPr>
+        <w:t xml:space="preserve">−1</w:t>
+      </w:r>
+      <w:r>
+        <w:t xml:space="preserve"> means. </w:t>
       </w:r>
       <w:r>
         <w:rPr>

</xml_diff>